<commit_message>
Word files: reorder table-cell properties into the standard OOXML order (content unchanged); add free Cambridge IGCSE Business lesson: ownership for a growing bakery (0264/0774, PDF and Word)
Co-Authored-By: Claude Opus 5.5 <noreply@anthropic.com>
</commit_message>
<xml_diff>
--- a/resources/a-level-business-break-even-price-decision/A-Level-Business-Break-even-Price-Decision-Student.docx
+++ b/resources/a-level-business-break-even-price-decision/A-Level-Business-Break-even-Price-Decision-Student.docx
@@ -47,13 +47,13 @@
         <w:tc>
           <w:tcPr>
             <w:tcW w:type="dxa" w:w="7106"/>
-            <w:shd w:fill="142D40"/>
             <w:tcBorders>
               <w:top w:val="single" w:sz="4" w:color="D9D9D9"/>
               <w:bottom w:val="single" w:sz="4" w:color="D9D9D9"/>
               <w:left w:val="single" w:sz="4" w:color="D9D9D9"/>
               <w:right w:val="single" w:sz="4" w:color="D9D9D9"/>
             </w:tcBorders>
+            <w:shd w:fill="142D40"/>
             <w:tcMar>
               <w:top w:w="85" w:type="dxa"/>
               <w:bottom w:w="85" w:type="dxa"/>
@@ -78,13 +78,13 @@
         <w:tc>
           <w:tcPr>
             <w:tcW w:type="dxa" w:w="3046"/>
-            <w:shd w:fill="142D40"/>
             <w:tcBorders>
               <w:top w:val="single" w:sz="4" w:color="D9D9D9"/>
               <w:bottom w:val="single" w:sz="4" w:color="D9D9D9"/>
               <w:left w:val="single" w:sz="4" w:color="D9D9D9"/>
               <w:right w:val="single" w:sz="4" w:color="D9D9D9"/>
             </w:tcBorders>
+            <w:shd w:fill="142D40"/>
             <w:tcMar>
               <w:top w:w="85" w:type="dxa"/>
               <w:bottom w:w="85" w:type="dxa"/>
@@ -111,13 +111,13 @@
         <w:tc>
           <w:tcPr>
             <w:tcW w:type="dxa" w:w="7106"/>
-            <w:shd w:fill="FFFFFF"/>
             <w:tcBorders>
               <w:top w:val="single" w:sz="4" w:color="D9D9D9"/>
               <w:bottom w:val="single" w:sz="4" w:color="D9D9D9"/>
               <w:left w:val="single" w:sz="4" w:color="D9D9D9"/>
               <w:right w:val="single" w:sz="4" w:color="D9D9D9"/>
             </w:tcBorders>
+            <w:shd w:fill="FFFFFF"/>
             <w:tcMar>
               <w:top w:w="85" w:type="dxa"/>
               <w:bottom w:w="85" w:type="dxa"/>
@@ -142,13 +142,13 @@
         <w:tc>
           <w:tcPr>
             <w:tcW w:type="dxa" w:w="3046"/>
-            <w:shd w:fill="FFFFFF"/>
             <w:tcBorders>
               <w:top w:val="single" w:sz="4" w:color="D9D9D9"/>
               <w:bottom w:val="single" w:sz="4" w:color="D9D9D9"/>
               <w:left w:val="single" w:sz="4" w:color="D9D9D9"/>
               <w:right w:val="single" w:sz="4" w:color="D9D9D9"/>
             </w:tcBorders>
+            <w:shd w:fill="FFFFFF"/>
             <w:tcMar>
               <w:top w:w="85" w:type="dxa"/>
               <w:bottom w:w="85" w:type="dxa"/>
@@ -175,13 +175,13 @@
         <w:tc>
           <w:tcPr>
             <w:tcW w:type="dxa" w:w="7106"/>
-            <w:shd w:fill="F1F5F7"/>
             <w:tcBorders>
               <w:top w:val="single" w:sz="4" w:color="D9D9D9"/>
               <w:bottom w:val="single" w:sz="4" w:color="D9D9D9"/>
               <w:left w:val="single" w:sz="4" w:color="D9D9D9"/>
               <w:right w:val="single" w:sz="4" w:color="D9D9D9"/>
             </w:tcBorders>
+            <w:shd w:fill="F1F5F7"/>
             <w:tcMar>
               <w:top w:w="85" w:type="dxa"/>
               <w:bottom w:w="85" w:type="dxa"/>
@@ -206,13 +206,13 @@
         <w:tc>
           <w:tcPr>
             <w:tcW w:type="dxa" w:w="3046"/>
-            <w:shd w:fill="F1F5F7"/>
             <w:tcBorders>
               <w:top w:val="single" w:sz="4" w:color="D9D9D9"/>
               <w:bottom w:val="single" w:sz="4" w:color="D9D9D9"/>
               <w:left w:val="single" w:sz="4" w:color="D9D9D9"/>
               <w:right w:val="single" w:sz="4" w:color="D9D9D9"/>
             </w:tcBorders>
+            <w:shd w:fill="F1F5F7"/>
             <w:tcMar>
               <w:top w:w="85" w:type="dxa"/>
               <w:bottom w:w="85" w:type="dxa"/>
@@ -239,13 +239,13 @@
         <w:tc>
           <w:tcPr>
             <w:tcW w:type="dxa" w:w="7106"/>
-            <w:shd w:fill="FFFFFF"/>
             <w:tcBorders>
               <w:top w:val="single" w:sz="4" w:color="D9D9D9"/>
               <w:bottom w:val="single" w:sz="4" w:color="D9D9D9"/>
               <w:left w:val="single" w:sz="4" w:color="D9D9D9"/>
               <w:right w:val="single" w:sz="4" w:color="D9D9D9"/>
             </w:tcBorders>
+            <w:shd w:fill="FFFFFF"/>
             <w:tcMar>
               <w:top w:w="85" w:type="dxa"/>
               <w:bottom w:w="85" w:type="dxa"/>
@@ -270,13 +270,13 @@
         <w:tc>
           <w:tcPr>
             <w:tcW w:type="dxa" w:w="3046"/>
-            <w:shd w:fill="FFFFFF"/>
             <w:tcBorders>
               <w:top w:val="single" w:sz="4" w:color="D9D9D9"/>
               <w:bottom w:val="single" w:sz="4" w:color="D9D9D9"/>
               <w:left w:val="single" w:sz="4" w:color="D9D9D9"/>
               <w:right w:val="single" w:sz="4" w:color="D9D9D9"/>
             </w:tcBorders>
+            <w:shd w:fill="FFFFFF"/>
             <w:tcMar>
               <w:top w:w="85" w:type="dxa"/>
               <w:bottom w:w="85" w:type="dxa"/>
@@ -303,13 +303,13 @@
         <w:tc>
           <w:tcPr>
             <w:tcW w:type="dxa" w:w="7106"/>
-            <w:shd w:fill="F1F5F7"/>
             <w:tcBorders>
               <w:top w:val="single" w:sz="4" w:color="D9D9D9"/>
               <w:bottom w:val="single" w:sz="4" w:color="D9D9D9"/>
               <w:left w:val="single" w:sz="4" w:color="D9D9D9"/>
               <w:right w:val="single" w:sz="4" w:color="D9D9D9"/>
             </w:tcBorders>
+            <w:shd w:fill="F1F5F7"/>
             <w:tcMar>
               <w:top w:w="85" w:type="dxa"/>
               <w:bottom w:w="85" w:type="dxa"/>
@@ -334,13 +334,13 @@
         <w:tc>
           <w:tcPr>
             <w:tcW w:type="dxa" w:w="3046"/>
-            <w:shd w:fill="F1F5F7"/>
             <w:tcBorders>
               <w:top w:val="single" w:sz="4" w:color="D9D9D9"/>
               <w:bottom w:val="single" w:sz="4" w:color="D9D9D9"/>
               <w:left w:val="single" w:sz="4" w:color="D9D9D9"/>
               <w:right w:val="single" w:sz="4" w:color="D9D9D9"/>
             </w:tcBorders>
+            <w:shd w:fill="F1F5F7"/>
             <w:tcMar>
               <w:top w:w="85" w:type="dxa"/>
               <w:bottom w:w="85" w:type="dxa"/>
@@ -656,13 +656,13 @@
         <w:tc>
           <w:tcPr>
             <w:tcW w:type="dxa" w:w="4670"/>
-            <w:shd w:fill="142D40"/>
             <w:tcBorders>
               <w:top w:val="single" w:sz="4" w:color="D9D9D9"/>
               <w:bottom w:val="single" w:sz="4" w:color="D9D9D9"/>
               <w:left w:val="single" w:sz="4" w:color="D9D9D9"/>
               <w:right w:val="single" w:sz="4" w:color="D9D9D9"/>
             </w:tcBorders>
+            <w:shd w:fill="142D40"/>
             <w:tcMar>
               <w:top w:w="85" w:type="dxa"/>
               <w:bottom w:w="85" w:type="dxa"/>
@@ -687,13 +687,13 @@
         <w:tc>
           <w:tcPr>
             <w:tcW w:type="dxa" w:w="1827"/>
-            <w:shd w:fill="142D40"/>
             <w:tcBorders>
               <w:top w:val="single" w:sz="4" w:color="D9D9D9"/>
               <w:bottom w:val="single" w:sz="4" w:color="D9D9D9"/>
               <w:left w:val="single" w:sz="4" w:color="D9D9D9"/>
               <w:right w:val="single" w:sz="4" w:color="D9D9D9"/>
             </w:tcBorders>
+            <w:shd w:fill="142D40"/>
             <w:tcMar>
               <w:top w:w="85" w:type="dxa"/>
               <w:bottom w:w="85" w:type="dxa"/>
@@ -718,13 +718,13 @@
         <w:tc>
           <w:tcPr>
             <w:tcW w:type="dxa" w:w="1827"/>
-            <w:shd w:fill="142D40"/>
             <w:tcBorders>
               <w:top w:val="single" w:sz="4" w:color="D9D9D9"/>
               <w:bottom w:val="single" w:sz="4" w:color="D9D9D9"/>
               <w:left w:val="single" w:sz="4" w:color="D9D9D9"/>
               <w:right w:val="single" w:sz="4" w:color="D9D9D9"/>
             </w:tcBorders>
+            <w:shd w:fill="142D40"/>
             <w:tcMar>
               <w:top w:w="85" w:type="dxa"/>
               <w:bottom w:w="85" w:type="dxa"/>
@@ -749,13 +749,13 @@
         <w:tc>
           <w:tcPr>
             <w:tcW w:type="dxa" w:w="1827"/>
-            <w:shd w:fill="142D40"/>
             <w:tcBorders>
               <w:top w:val="single" w:sz="4" w:color="D9D9D9"/>
               <w:bottom w:val="single" w:sz="4" w:color="D9D9D9"/>
               <w:left w:val="single" w:sz="4" w:color="D9D9D9"/>
               <w:right w:val="single" w:sz="4" w:color="D9D9D9"/>
             </w:tcBorders>
+            <w:shd w:fill="142D40"/>
             <w:tcMar>
               <w:top w:w="85" w:type="dxa"/>
               <w:bottom w:w="85" w:type="dxa"/>
@@ -782,13 +782,13 @@
         <w:tc>
           <w:tcPr>
             <w:tcW w:type="dxa" w:w="4670"/>
-            <w:shd w:fill="FFFFFF"/>
             <w:tcBorders>
               <w:top w:val="single" w:sz="4" w:color="D9D9D9"/>
               <w:bottom w:val="single" w:sz="4" w:color="D9D9D9"/>
               <w:left w:val="single" w:sz="4" w:color="D9D9D9"/>
               <w:right w:val="single" w:sz="4" w:color="D9D9D9"/>
             </w:tcBorders>
+            <w:shd w:fill="FFFFFF"/>
             <w:tcMar>
               <w:top w:w="85" w:type="dxa"/>
               <w:bottom w:w="85" w:type="dxa"/>
@@ -813,13 +813,13 @@
         <w:tc>
           <w:tcPr>
             <w:tcW w:type="dxa" w:w="1827"/>
-            <w:shd w:fill="FFFFFF"/>
             <w:tcBorders>
               <w:top w:val="single" w:sz="4" w:color="D9D9D9"/>
               <w:bottom w:val="single" w:sz="4" w:color="D9D9D9"/>
               <w:left w:val="single" w:sz="4" w:color="D9D9D9"/>
               <w:right w:val="single" w:sz="4" w:color="D9D9D9"/>
             </w:tcBorders>
+            <w:shd w:fill="FFFFFF"/>
             <w:tcMar>
               <w:top w:w="85" w:type="dxa"/>
               <w:bottom w:w="85" w:type="dxa"/>
@@ -844,13 +844,13 @@
         <w:tc>
           <w:tcPr>
             <w:tcW w:type="dxa" w:w="1827"/>
-            <w:shd w:fill="FFFFFF"/>
             <w:tcBorders>
               <w:top w:val="single" w:sz="4" w:color="D9D9D9"/>
               <w:bottom w:val="single" w:sz="4" w:color="D9D9D9"/>
               <w:left w:val="single" w:sz="4" w:color="D9D9D9"/>
               <w:right w:val="single" w:sz="4" w:color="D9D9D9"/>
             </w:tcBorders>
+            <w:shd w:fill="FFFFFF"/>
             <w:tcMar>
               <w:top w:w="85" w:type="dxa"/>
               <w:bottom w:w="85" w:type="dxa"/>
@@ -874,13 +874,13 @@
         <w:tc>
           <w:tcPr>
             <w:tcW w:type="dxa" w:w="1827"/>
-            <w:shd w:fill="FFFFFF"/>
             <w:tcBorders>
               <w:top w:val="single" w:sz="4" w:color="D9D9D9"/>
               <w:bottom w:val="single" w:sz="4" w:color="D9D9D9"/>
               <w:left w:val="single" w:sz="4" w:color="D9D9D9"/>
               <w:right w:val="single" w:sz="4" w:color="D9D9D9"/>
             </w:tcBorders>
+            <w:shd w:fill="FFFFFF"/>
             <w:tcMar>
               <w:top w:w="85" w:type="dxa"/>
               <w:bottom w:w="85" w:type="dxa"/>
@@ -906,13 +906,13 @@
         <w:tc>
           <w:tcPr>
             <w:tcW w:type="dxa" w:w="4670"/>
-            <w:shd w:fill="F1F5F7"/>
             <w:tcBorders>
               <w:top w:val="single" w:sz="4" w:color="D9D9D9"/>
               <w:bottom w:val="single" w:sz="4" w:color="D9D9D9"/>
               <w:left w:val="single" w:sz="4" w:color="D9D9D9"/>
               <w:right w:val="single" w:sz="4" w:color="D9D9D9"/>
             </w:tcBorders>
+            <w:shd w:fill="F1F5F7"/>
             <w:tcMar>
               <w:top w:w="85" w:type="dxa"/>
               <w:bottom w:w="85" w:type="dxa"/>
@@ -937,13 +937,13 @@
         <w:tc>
           <w:tcPr>
             <w:tcW w:type="dxa" w:w="1827"/>
-            <w:shd w:fill="F1F5F7"/>
             <w:tcBorders>
               <w:top w:val="single" w:sz="4" w:color="D9D9D9"/>
               <w:bottom w:val="single" w:sz="4" w:color="D9D9D9"/>
               <w:left w:val="single" w:sz="4" w:color="D9D9D9"/>
               <w:right w:val="single" w:sz="4" w:color="D9D9D9"/>
             </w:tcBorders>
+            <w:shd w:fill="F1F5F7"/>
             <w:tcMar>
               <w:top w:w="85" w:type="dxa"/>
               <w:bottom w:w="85" w:type="dxa"/>
@@ -968,13 +968,13 @@
         <w:tc>
           <w:tcPr>
             <w:tcW w:type="dxa" w:w="1827"/>
-            <w:shd w:fill="F1F5F7"/>
             <w:tcBorders>
               <w:top w:val="single" w:sz="4" w:color="D9D9D9"/>
               <w:bottom w:val="single" w:sz="4" w:color="D9D9D9"/>
               <w:left w:val="single" w:sz="4" w:color="D9D9D9"/>
               <w:right w:val="single" w:sz="4" w:color="D9D9D9"/>
             </w:tcBorders>
+            <w:shd w:fill="F1F5F7"/>
             <w:tcMar>
               <w:top w:w="85" w:type="dxa"/>
               <w:bottom w:w="85" w:type="dxa"/>
@@ -998,13 +998,13 @@
         <w:tc>
           <w:tcPr>
             <w:tcW w:type="dxa" w:w="1827"/>
-            <w:shd w:fill="F1F5F7"/>
             <w:tcBorders>
               <w:top w:val="single" w:sz="4" w:color="D9D9D9"/>
               <w:bottom w:val="single" w:sz="4" w:color="D9D9D9"/>
               <w:left w:val="single" w:sz="4" w:color="D9D9D9"/>
               <w:right w:val="single" w:sz="4" w:color="D9D9D9"/>
             </w:tcBorders>
+            <w:shd w:fill="F1F5F7"/>
             <w:tcMar>
               <w:top w:w="85" w:type="dxa"/>
               <w:bottom w:w="85" w:type="dxa"/>
@@ -1030,13 +1030,13 @@
         <w:tc>
           <w:tcPr>
             <w:tcW w:type="dxa" w:w="4670"/>
-            <w:shd w:fill="FFFFFF"/>
             <w:tcBorders>
               <w:top w:val="single" w:sz="4" w:color="D9D9D9"/>
               <w:bottom w:val="single" w:sz="4" w:color="D9D9D9"/>
               <w:left w:val="single" w:sz="4" w:color="D9D9D9"/>
               <w:right w:val="single" w:sz="4" w:color="D9D9D9"/>
             </w:tcBorders>
+            <w:shd w:fill="FFFFFF"/>
             <w:tcMar>
               <w:top w:w="85" w:type="dxa"/>
               <w:bottom w:w="85" w:type="dxa"/>
@@ -1061,13 +1061,13 @@
         <w:tc>
           <w:tcPr>
             <w:tcW w:type="dxa" w:w="1827"/>
-            <w:shd w:fill="FFFFFF"/>
             <w:tcBorders>
               <w:top w:val="single" w:sz="4" w:color="D9D9D9"/>
               <w:bottom w:val="single" w:sz="4" w:color="D9D9D9"/>
               <w:left w:val="single" w:sz="4" w:color="D9D9D9"/>
               <w:right w:val="single" w:sz="4" w:color="D9D9D9"/>
             </w:tcBorders>
+            <w:shd w:fill="FFFFFF"/>
             <w:tcMar>
               <w:top w:w="85" w:type="dxa"/>
               <w:bottom w:w="85" w:type="dxa"/>
@@ -1092,13 +1092,13 @@
         <w:tc>
           <w:tcPr>
             <w:tcW w:type="dxa" w:w="1827"/>
-            <w:shd w:fill="FFFFFF"/>
             <w:tcBorders>
               <w:top w:val="single" w:sz="4" w:color="D9D9D9"/>
               <w:bottom w:val="single" w:sz="4" w:color="D9D9D9"/>
               <w:left w:val="single" w:sz="4" w:color="D9D9D9"/>
               <w:right w:val="single" w:sz="4" w:color="D9D9D9"/>
             </w:tcBorders>
+            <w:shd w:fill="FFFFFF"/>
             <w:tcMar>
               <w:top w:w="85" w:type="dxa"/>
               <w:bottom w:w="85" w:type="dxa"/>
@@ -1122,13 +1122,13 @@
         <w:tc>
           <w:tcPr>
             <w:tcW w:type="dxa" w:w="1827"/>
-            <w:shd w:fill="FFFFFF"/>
             <w:tcBorders>
               <w:top w:val="single" w:sz="4" w:color="D9D9D9"/>
               <w:bottom w:val="single" w:sz="4" w:color="D9D9D9"/>
               <w:left w:val="single" w:sz="4" w:color="D9D9D9"/>
               <w:right w:val="single" w:sz="4" w:color="D9D9D9"/>
             </w:tcBorders>
+            <w:shd w:fill="FFFFFF"/>
             <w:tcMar>
               <w:top w:w="85" w:type="dxa"/>
               <w:bottom w:w="85" w:type="dxa"/>
@@ -1154,13 +1154,13 @@
         <w:tc>
           <w:tcPr>
             <w:tcW w:type="dxa" w:w="4670"/>
-            <w:shd w:fill="F1F5F7"/>
             <w:tcBorders>
               <w:top w:val="single" w:sz="4" w:color="D9D9D9"/>
               <w:bottom w:val="single" w:sz="4" w:color="D9D9D9"/>
               <w:left w:val="single" w:sz="4" w:color="D9D9D9"/>
               <w:right w:val="single" w:sz="4" w:color="D9D9D9"/>
             </w:tcBorders>
+            <w:shd w:fill="F1F5F7"/>
             <w:tcMar>
               <w:top w:w="85" w:type="dxa"/>
               <w:bottom w:w="85" w:type="dxa"/>
@@ -1185,13 +1185,13 @@
         <w:tc>
           <w:tcPr>
             <w:tcW w:type="dxa" w:w="1827"/>
-            <w:shd w:fill="F1F5F7"/>
             <w:tcBorders>
               <w:top w:val="single" w:sz="4" w:color="D9D9D9"/>
               <w:bottom w:val="single" w:sz="4" w:color="D9D9D9"/>
               <w:left w:val="single" w:sz="4" w:color="D9D9D9"/>
               <w:right w:val="single" w:sz="4" w:color="D9D9D9"/>
             </w:tcBorders>
+            <w:shd w:fill="F1F5F7"/>
             <w:tcMar>
               <w:top w:w="85" w:type="dxa"/>
               <w:bottom w:w="85" w:type="dxa"/>
@@ -1216,13 +1216,13 @@
         <w:tc>
           <w:tcPr>
             <w:tcW w:type="dxa" w:w="1827"/>
-            <w:shd w:fill="F1F5F7"/>
             <w:tcBorders>
               <w:top w:val="single" w:sz="4" w:color="D9D9D9"/>
               <w:bottom w:val="single" w:sz="4" w:color="D9D9D9"/>
               <w:left w:val="single" w:sz="4" w:color="D9D9D9"/>
               <w:right w:val="single" w:sz="4" w:color="D9D9D9"/>
             </w:tcBorders>
+            <w:shd w:fill="F1F5F7"/>
             <w:tcMar>
               <w:top w:w="85" w:type="dxa"/>
               <w:bottom w:w="85" w:type="dxa"/>
@@ -1247,13 +1247,13 @@
         <w:tc>
           <w:tcPr>
             <w:tcW w:type="dxa" w:w="1827"/>
-            <w:shd w:fill="F1F5F7"/>
             <w:tcBorders>
               <w:top w:val="single" w:sz="4" w:color="D9D9D9"/>
               <w:bottom w:val="single" w:sz="4" w:color="D9D9D9"/>
               <w:left w:val="single" w:sz="4" w:color="D9D9D9"/>
               <w:right w:val="single" w:sz="4" w:color="D9D9D9"/>
             </w:tcBorders>
+            <w:shd w:fill="F1F5F7"/>
             <w:tcMar>
               <w:top w:w="85" w:type="dxa"/>
               <w:bottom w:w="85" w:type="dxa"/>
@@ -1280,13 +1280,13 @@
         <w:tc>
           <w:tcPr>
             <w:tcW w:type="dxa" w:w="4670"/>
-            <w:shd w:fill="FFFFFF"/>
             <w:tcBorders>
               <w:top w:val="single" w:sz="4" w:color="D9D9D9"/>
               <w:bottom w:val="single" w:sz="4" w:color="D9D9D9"/>
               <w:left w:val="single" w:sz="4" w:color="D9D9D9"/>
               <w:right w:val="single" w:sz="4" w:color="D9D9D9"/>
             </w:tcBorders>
+            <w:shd w:fill="FFFFFF"/>
             <w:tcMar>
               <w:top w:w="85" w:type="dxa"/>
               <w:bottom w:w="85" w:type="dxa"/>
@@ -1311,13 +1311,13 @@
         <w:tc>
           <w:tcPr>
             <w:tcW w:type="dxa" w:w="1827"/>
-            <w:shd w:fill="FFFFFF"/>
             <w:tcBorders>
               <w:top w:val="single" w:sz="4" w:color="D9D9D9"/>
               <w:bottom w:val="single" w:sz="4" w:color="D9D9D9"/>
               <w:left w:val="single" w:sz="4" w:color="D9D9D9"/>
               <w:right w:val="single" w:sz="4" w:color="D9D9D9"/>
             </w:tcBorders>
+            <w:shd w:fill="FFFFFF"/>
             <w:tcMar>
               <w:top w:w="85" w:type="dxa"/>
               <w:bottom w:w="85" w:type="dxa"/>
@@ -1342,13 +1342,13 @@
         <w:tc>
           <w:tcPr>
             <w:tcW w:type="dxa" w:w="1827"/>
-            <w:shd w:fill="FFFFFF"/>
             <w:tcBorders>
               <w:top w:val="single" w:sz="4" w:color="D9D9D9"/>
               <w:bottom w:val="single" w:sz="4" w:color="D9D9D9"/>
               <w:left w:val="single" w:sz="4" w:color="D9D9D9"/>
               <w:right w:val="single" w:sz="4" w:color="D9D9D9"/>
             </w:tcBorders>
+            <w:shd w:fill="FFFFFF"/>
             <w:tcMar>
               <w:top w:w="85" w:type="dxa"/>
               <w:bottom w:w="85" w:type="dxa"/>
@@ -1372,13 +1372,13 @@
         <w:tc>
           <w:tcPr>
             <w:tcW w:type="dxa" w:w="1827"/>
-            <w:shd w:fill="FFFFFF"/>
             <w:tcBorders>
               <w:top w:val="single" w:sz="4" w:color="D9D9D9"/>
               <w:bottom w:val="single" w:sz="4" w:color="D9D9D9"/>
               <w:left w:val="single" w:sz="4" w:color="D9D9D9"/>
               <w:right w:val="single" w:sz="4" w:color="D9D9D9"/>
             </w:tcBorders>
+            <w:shd w:fill="FFFFFF"/>
             <w:tcMar>
               <w:top w:w="85" w:type="dxa"/>
               <w:bottom w:w="85" w:type="dxa"/>
@@ -1404,13 +1404,13 @@
         <w:tc>
           <w:tcPr>
             <w:tcW w:type="dxa" w:w="4670"/>
-            <w:shd w:fill="F1F5F7"/>
             <w:tcBorders>
               <w:top w:val="single" w:sz="4" w:color="D9D9D9"/>
               <w:bottom w:val="single" w:sz="4" w:color="D9D9D9"/>
               <w:left w:val="single" w:sz="4" w:color="D9D9D9"/>
               <w:right w:val="single" w:sz="4" w:color="D9D9D9"/>
             </w:tcBorders>
+            <w:shd w:fill="F1F5F7"/>
             <w:tcMar>
               <w:top w:w="85" w:type="dxa"/>
               <w:bottom w:w="85" w:type="dxa"/>
@@ -1435,13 +1435,13 @@
         <w:tc>
           <w:tcPr>
             <w:tcW w:type="dxa" w:w="1827"/>
-            <w:shd w:fill="F1F5F7"/>
             <w:tcBorders>
               <w:top w:val="single" w:sz="4" w:color="D9D9D9"/>
               <w:bottom w:val="single" w:sz="4" w:color="D9D9D9"/>
               <w:left w:val="single" w:sz="4" w:color="D9D9D9"/>
               <w:right w:val="single" w:sz="4" w:color="D9D9D9"/>
             </w:tcBorders>
+            <w:shd w:fill="F1F5F7"/>
             <w:tcMar>
               <w:top w:w="85" w:type="dxa"/>
               <w:bottom w:w="85" w:type="dxa"/>
@@ -1466,13 +1466,13 @@
         <w:tc>
           <w:tcPr>
             <w:tcW w:type="dxa" w:w="1827"/>
-            <w:shd w:fill="F1F5F7"/>
             <w:tcBorders>
               <w:top w:val="single" w:sz="4" w:color="D9D9D9"/>
               <w:bottom w:val="single" w:sz="4" w:color="D9D9D9"/>
               <w:left w:val="single" w:sz="4" w:color="D9D9D9"/>
               <w:right w:val="single" w:sz="4" w:color="D9D9D9"/>
             </w:tcBorders>
+            <w:shd w:fill="F1F5F7"/>
             <w:tcMar>
               <w:top w:w="85" w:type="dxa"/>
               <w:bottom w:w="85" w:type="dxa"/>
@@ -1496,13 +1496,13 @@
         <w:tc>
           <w:tcPr>
             <w:tcW w:type="dxa" w:w="1827"/>
-            <w:shd w:fill="F1F5F7"/>
             <w:tcBorders>
               <w:top w:val="single" w:sz="4" w:color="D9D9D9"/>
               <w:bottom w:val="single" w:sz="4" w:color="D9D9D9"/>
               <w:left w:val="single" w:sz="4" w:color="D9D9D9"/>
               <w:right w:val="single" w:sz="4" w:color="D9D9D9"/>
             </w:tcBorders>
+            <w:shd w:fill="F1F5F7"/>
             <w:tcMar>
               <w:top w:w="85" w:type="dxa"/>
               <w:bottom w:w="85" w:type="dxa"/>
@@ -1528,13 +1528,13 @@
         <w:tc>
           <w:tcPr>
             <w:tcW w:type="dxa" w:w="4670"/>
-            <w:shd w:fill="FFFFFF"/>
             <w:tcBorders>
               <w:top w:val="single" w:sz="4" w:color="D9D9D9"/>
               <w:bottom w:val="single" w:sz="4" w:color="D9D9D9"/>
               <w:left w:val="single" w:sz="4" w:color="D9D9D9"/>
               <w:right w:val="single" w:sz="4" w:color="D9D9D9"/>
             </w:tcBorders>
+            <w:shd w:fill="FFFFFF"/>
             <w:tcMar>
               <w:top w:w="85" w:type="dxa"/>
               <w:bottom w:w="85" w:type="dxa"/>
@@ -1559,13 +1559,13 @@
         <w:tc>
           <w:tcPr>
             <w:tcW w:type="dxa" w:w="1827"/>
-            <w:shd w:fill="FFFFFF"/>
             <w:tcBorders>
               <w:top w:val="single" w:sz="4" w:color="D9D9D9"/>
               <w:bottom w:val="single" w:sz="4" w:color="D9D9D9"/>
               <w:left w:val="single" w:sz="4" w:color="D9D9D9"/>
               <w:right w:val="single" w:sz="4" w:color="D9D9D9"/>
             </w:tcBorders>
+            <w:shd w:fill="FFFFFF"/>
             <w:tcMar>
               <w:top w:w="85" w:type="dxa"/>
               <w:bottom w:w="85" w:type="dxa"/>
@@ -1590,13 +1590,13 @@
         <w:tc>
           <w:tcPr>
             <w:tcW w:type="dxa" w:w="1827"/>
-            <w:shd w:fill="FFFFFF"/>
             <w:tcBorders>
               <w:top w:val="single" w:sz="4" w:color="D9D9D9"/>
               <w:bottom w:val="single" w:sz="4" w:color="D9D9D9"/>
               <w:left w:val="single" w:sz="4" w:color="D9D9D9"/>
               <w:right w:val="single" w:sz="4" w:color="D9D9D9"/>
             </w:tcBorders>
+            <w:shd w:fill="FFFFFF"/>
             <w:tcMar>
               <w:top w:w="85" w:type="dxa"/>
               <w:bottom w:w="85" w:type="dxa"/>
@@ -1620,13 +1620,13 @@
         <w:tc>
           <w:tcPr>
             <w:tcW w:type="dxa" w:w="1827"/>
-            <w:shd w:fill="FFFFFF"/>
             <w:tcBorders>
               <w:top w:val="single" w:sz="4" w:color="D9D9D9"/>
               <w:bottom w:val="single" w:sz="4" w:color="D9D9D9"/>
               <w:left w:val="single" w:sz="4" w:color="D9D9D9"/>
               <w:right w:val="single" w:sz="4" w:color="D9D9D9"/>
             </w:tcBorders>
+            <w:shd w:fill="FFFFFF"/>
             <w:tcMar>
               <w:top w:w="85" w:type="dxa"/>
               <w:bottom w:w="85" w:type="dxa"/>

</xml_diff>

<commit_message>
Word files: also order cell border and margin sides as the OOXML standard requires (content unchanged)
Co-Authored-By: Claude Opus 5.5 <noreply@anthropic.com>
</commit_message>
<xml_diff>
--- a/resources/a-level-business-break-even-price-decision/A-Level-Business-Break-even-Price-Decision-Student.docx
+++ b/resources/a-level-business-break-even-price-decision/A-Level-Business-Break-even-Price-Decision-Student.docx
@@ -49,15 +49,15 @@
             <w:tcW w:type="dxa" w:w="7106"/>
             <w:tcBorders>
               <w:top w:val="single" w:sz="4" w:color="D9D9D9"/>
+              <w:left w:val="single" w:sz="4" w:color="D9D9D9"/>
               <w:bottom w:val="single" w:sz="4" w:color="D9D9D9"/>
-              <w:left w:val="single" w:sz="4" w:color="D9D9D9"/>
               <w:right w:val="single" w:sz="4" w:color="D9D9D9"/>
             </w:tcBorders>
             <w:shd w:fill="142D40"/>
             <w:tcMar>
               <w:top w:w="85" w:type="dxa"/>
+              <w:left w:w="85" w:type="dxa"/>
               <w:bottom w:w="85" w:type="dxa"/>
-              <w:left w:w="85" w:type="dxa"/>
               <w:right w:w="85" w:type="dxa"/>
             </w:tcMar>
           </w:tcPr>
@@ -80,15 +80,15 @@
             <w:tcW w:type="dxa" w:w="3046"/>
             <w:tcBorders>
               <w:top w:val="single" w:sz="4" w:color="D9D9D9"/>
+              <w:left w:val="single" w:sz="4" w:color="D9D9D9"/>
               <w:bottom w:val="single" w:sz="4" w:color="D9D9D9"/>
-              <w:left w:val="single" w:sz="4" w:color="D9D9D9"/>
               <w:right w:val="single" w:sz="4" w:color="D9D9D9"/>
             </w:tcBorders>
             <w:shd w:fill="142D40"/>
             <w:tcMar>
               <w:top w:w="85" w:type="dxa"/>
+              <w:left w:w="85" w:type="dxa"/>
               <w:bottom w:w="85" w:type="dxa"/>
-              <w:left w:w="85" w:type="dxa"/>
               <w:right w:w="85" w:type="dxa"/>
             </w:tcMar>
           </w:tcPr>
@@ -113,15 +113,15 @@
             <w:tcW w:type="dxa" w:w="7106"/>
             <w:tcBorders>
               <w:top w:val="single" w:sz="4" w:color="D9D9D9"/>
+              <w:left w:val="single" w:sz="4" w:color="D9D9D9"/>
               <w:bottom w:val="single" w:sz="4" w:color="D9D9D9"/>
-              <w:left w:val="single" w:sz="4" w:color="D9D9D9"/>
               <w:right w:val="single" w:sz="4" w:color="D9D9D9"/>
             </w:tcBorders>
             <w:shd w:fill="FFFFFF"/>
             <w:tcMar>
               <w:top w:w="85" w:type="dxa"/>
+              <w:left w:w="85" w:type="dxa"/>
               <w:bottom w:w="85" w:type="dxa"/>
-              <w:left w:w="85" w:type="dxa"/>
               <w:right w:w="85" w:type="dxa"/>
             </w:tcMar>
           </w:tcPr>
@@ -144,15 +144,15 @@
             <w:tcW w:type="dxa" w:w="3046"/>
             <w:tcBorders>
               <w:top w:val="single" w:sz="4" w:color="D9D9D9"/>
+              <w:left w:val="single" w:sz="4" w:color="D9D9D9"/>
               <w:bottom w:val="single" w:sz="4" w:color="D9D9D9"/>
-              <w:left w:val="single" w:sz="4" w:color="D9D9D9"/>
               <w:right w:val="single" w:sz="4" w:color="D9D9D9"/>
             </w:tcBorders>
             <w:shd w:fill="FFFFFF"/>
             <w:tcMar>
               <w:top w:w="85" w:type="dxa"/>
+              <w:left w:w="85" w:type="dxa"/>
               <w:bottom w:w="85" w:type="dxa"/>
-              <w:left w:w="85" w:type="dxa"/>
               <w:right w:w="85" w:type="dxa"/>
             </w:tcMar>
           </w:tcPr>
@@ -177,15 +177,15 @@
             <w:tcW w:type="dxa" w:w="7106"/>
             <w:tcBorders>
               <w:top w:val="single" w:sz="4" w:color="D9D9D9"/>
+              <w:left w:val="single" w:sz="4" w:color="D9D9D9"/>
               <w:bottom w:val="single" w:sz="4" w:color="D9D9D9"/>
-              <w:left w:val="single" w:sz="4" w:color="D9D9D9"/>
               <w:right w:val="single" w:sz="4" w:color="D9D9D9"/>
             </w:tcBorders>
             <w:shd w:fill="F1F5F7"/>
             <w:tcMar>
               <w:top w:w="85" w:type="dxa"/>
+              <w:left w:w="85" w:type="dxa"/>
               <w:bottom w:w="85" w:type="dxa"/>
-              <w:left w:w="85" w:type="dxa"/>
               <w:right w:w="85" w:type="dxa"/>
             </w:tcMar>
           </w:tcPr>
@@ -208,15 +208,15 @@
             <w:tcW w:type="dxa" w:w="3046"/>
             <w:tcBorders>
               <w:top w:val="single" w:sz="4" w:color="D9D9D9"/>
+              <w:left w:val="single" w:sz="4" w:color="D9D9D9"/>
               <w:bottom w:val="single" w:sz="4" w:color="D9D9D9"/>
-              <w:left w:val="single" w:sz="4" w:color="D9D9D9"/>
               <w:right w:val="single" w:sz="4" w:color="D9D9D9"/>
             </w:tcBorders>
             <w:shd w:fill="F1F5F7"/>
             <w:tcMar>
               <w:top w:w="85" w:type="dxa"/>
+              <w:left w:w="85" w:type="dxa"/>
               <w:bottom w:w="85" w:type="dxa"/>
-              <w:left w:w="85" w:type="dxa"/>
               <w:right w:w="85" w:type="dxa"/>
             </w:tcMar>
           </w:tcPr>
@@ -241,15 +241,15 @@
             <w:tcW w:type="dxa" w:w="7106"/>
             <w:tcBorders>
               <w:top w:val="single" w:sz="4" w:color="D9D9D9"/>
+              <w:left w:val="single" w:sz="4" w:color="D9D9D9"/>
               <w:bottom w:val="single" w:sz="4" w:color="D9D9D9"/>
-              <w:left w:val="single" w:sz="4" w:color="D9D9D9"/>
               <w:right w:val="single" w:sz="4" w:color="D9D9D9"/>
             </w:tcBorders>
             <w:shd w:fill="FFFFFF"/>
             <w:tcMar>
               <w:top w:w="85" w:type="dxa"/>
+              <w:left w:w="85" w:type="dxa"/>
               <w:bottom w:w="85" w:type="dxa"/>
-              <w:left w:w="85" w:type="dxa"/>
               <w:right w:w="85" w:type="dxa"/>
             </w:tcMar>
           </w:tcPr>
@@ -272,15 +272,15 @@
             <w:tcW w:type="dxa" w:w="3046"/>
             <w:tcBorders>
               <w:top w:val="single" w:sz="4" w:color="D9D9D9"/>
+              <w:left w:val="single" w:sz="4" w:color="D9D9D9"/>
               <w:bottom w:val="single" w:sz="4" w:color="D9D9D9"/>
-              <w:left w:val="single" w:sz="4" w:color="D9D9D9"/>
               <w:right w:val="single" w:sz="4" w:color="D9D9D9"/>
             </w:tcBorders>
             <w:shd w:fill="FFFFFF"/>
             <w:tcMar>
               <w:top w:w="85" w:type="dxa"/>
+              <w:left w:w="85" w:type="dxa"/>
               <w:bottom w:w="85" w:type="dxa"/>
-              <w:left w:w="85" w:type="dxa"/>
               <w:right w:w="85" w:type="dxa"/>
             </w:tcMar>
           </w:tcPr>
@@ -305,15 +305,15 @@
             <w:tcW w:type="dxa" w:w="7106"/>
             <w:tcBorders>
               <w:top w:val="single" w:sz="4" w:color="D9D9D9"/>
+              <w:left w:val="single" w:sz="4" w:color="D9D9D9"/>
               <w:bottom w:val="single" w:sz="4" w:color="D9D9D9"/>
-              <w:left w:val="single" w:sz="4" w:color="D9D9D9"/>
               <w:right w:val="single" w:sz="4" w:color="D9D9D9"/>
             </w:tcBorders>
             <w:shd w:fill="F1F5F7"/>
             <w:tcMar>
               <w:top w:w="85" w:type="dxa"/>
+              <w:left w:w="85" w:type="dxa"/>
               <w:bottom w:w="85" w:type="dxa"/>
-              <w:left w:w="85" w:type="dxa"/>
               <w:right w:w="85" w:type="dxa"/>
             </w:tcMar>
           </w:tcPr>
@@ -336,15 +336,15 @@
             <w:tcW w:type="dxa" w:w="3046"/>
             <w:tcBorders>
               <w:top w:val="single" w:sz="4" w:color="D9D9D9"/>
+              <w:left w:val="single" w:sz="4" w:color="D9D9D9"/>
               <w:bottom w:val="single" w:sz="4" w:color="D9D9D9"/>
-              <w:left w:val="single" w:sz="4" w:color="D9D9D9"/>
               <w:right w:val="single" w:sz="4" w:color="D9D9D9"/>
             </w:tcBorders>
             <w:shd w:fill="F1F5F7"/>
             <w:tcMar>
               <w:top w:w="85" w:type="dxa"/>
+              <w:left w:w="85" w:type="dxa"/>
               <w:bottom w:w="85" w:type="dxa"/>
-              <w:left w:w="85" w:type="dxa"/>
               <w:right w:w="85" w:type="dxa"/>
             </w:tcMar>
           </w:tcPr>
@@ -658,15 +658,15 @@
             <w:tcW w:type="dxa" w:w="4670"/>
             <w:tcBorders>
               <w:top w:val="single" w:sz="4" w:color="D9D9D9"/>
+              <w:left w:val="single" w:sz="4" w:color="D9D9D9"/>
               <w:bottom w:val="single" w:sz="4" w:color="D9D9D9"/>
-              <w:left w:val="single" w:sz="4" w:color="D9D9D9"/>
               <w:right w:val="single" w:sz="4" w:color="D9D9D9"/>
             </w:tcBorders>
             <w:shd w:fill="142D40"/>
             <w:tcMar>
               <w:top w:w="85" w:type="dxa"/>
+              <w:left w:w="85" w:type="dxa"/>
               <w:bottom w:w="85" w:type="dxa"/>
-              <w:left w:w="85" w:type="dxa"/>
               <w:right w:w="85" w:type="dxa"/>
             </w:tcMar>
           </w:tcPr>
@@ -689,15 +689,15 @@
             <w:tcW w:type="dxa" w:w="1827"/>
             <w:tcBorders>
               <w:top w:val="single" w:sz="4" w:color="D9D9D9"/>
+              <w:left w:val="single" w:sz="4" w:color="D9D9D9"/>
               <w:bottom w:val="single" w:sz="4" w:color="D9D9D9"/>
-              <w:left w:val="single" w:sz="4" w:color="D9D9D9"/>
               <w:right w:val="single" w:sz="4" w:color="D9D9D9"/>
             </w:tcBorders>
             <w:shd w:fill="142D40"/>
             <w:tcMar>
               <w:top w:w="85" w:type="dxa"/>
+              <w:left w:w="85" w:type="dxa"/>
               <w:bottom w:w="85" w:type="dxa"/>
-              <w:left w:w="85" w:type="dxa"/>
               <w:right w:w="85" w:type="dxa"/>
             </w:tcMar>
           </w:tcPr>
@@ -720,15 +720,15 @@
             <w:tcW w:type="dxa" w:w="1827"/>
             <w:tcBorders>
               <w:top w:val="single" w:sz="4" w:color="D9D9D9"/>
+              <w:left w:val="single" w:sz="4" w:color="D9D9D9"/>
               <w:bottom w:val="single" w:sz="4" w:color="D9D9D9"/>
-              <w:left w:val="single" w:sz="4" w:color="D9D9D9"/>
               <w:right w:val="single" w:sz="4" w:color="D9D9D9"/>
             </w:tcBorders>
             <w:shd w:fill="142D40"/>
             <w:tcMar>
               <w:top w:w="85" w:type="dxa"/>
+              <w:left w:w="85" w:type="dxa"/>
               <w:bottom w:w="85" w:type="dxa"/>
-              <w:left w:w="85" w:type="dxa"/>
               <w:right w:w="85" w:type="dxa"/>
             </w:tcMar>
           </w:tcPr>
@@ -751,15 +751,15 @@
             <w:tcW w:type="dxa" w:w="1827"/>
             <w:tcBorders>
               <w:top w:val="single" w:sz="4" w:color="D9D9D9"/>
+              <w:left w:val="single" w:sz="4" w:color="D9D9D9"/>
               <w:bottom w:val="single" w:sz="4" w:color="D9D9D9"/>
-              <w:left w:val="single" w:sz="4" w:color="D9D9D9"/>
               <w:right w:val="single" w:sz="4" w:color="D9D9D9"/>
             </w:tcBorders>
             <w:shd w:fill="142D40"/>
             <w:tcMar>
               <w:top w:w="85" w:type="dxa"/>
+              <w:left w:w="85" w:type="dxa"/>
               <w:bottom w:w="85" w:type="dxa"/>
-              <w:left w:w="85" w:type="dxa"/>
               <w:right w:w="85" w:type="dxa"/>
             </w:tcMar>
           </w:tcPr>
@@ -784,15 +784,15 @@
             <w:tcW w:type="dxa" w:w="4670"/>
             <w:tcBorders>
               <w:top w:val="single" w:sz="4" w:color="D9D9D9"/>
+              <w:left w:val="single" w:sz="4" w:color="D9D9D9"/>
               <w:bottom w:val="single" w:sz="4" w:color="D9D9D9"/>
-              <w:left w:val="single" w:sz="4" w:color="D9D9D9"/>
               <w:right w:val="single" w:sz="4" w:color="D9D9D9"/>
             </w:tcBorders>
             <w:shd w:fill="FFFFFF"/>
             <w:tcMar>
               <w:top w:w="85" w:type="dxa"/>
+              <w:left w:w="85" w:type="dxa"/>
               <w:bottom w:w="85" w:type="dxa"/>
-              <w:left w:w="85" w:type="dxa"/>
               <w:right w:w="85" w:type="dxa"/>
             </w:tcMar>
           </w:tcPr>
@@ -815,15 +815,15 @@
             <w:tcW w:type="dxa" w:w="1827"/>
             <w:tcBorders>
               <w:top w:val="single" w:sz="4" w:color="D9D9D9"/>
+              <w:left w:val="single" w:sz="4" w:color="D9D9D9"/>
               <w:bottom w:val="single" w:sz="4" w:color="D9D9D9"/>
-              <w:left w:val="single" w:sz="4" w:color="D9D9D9"/>
               <w:right w:val="single" w:sz="4" w:color="D9D9D9"/>
             </w:tcBorders>
             <w:shd w:fill="FFFFFF"/>
             <w:tcMar>
               <w:top w:w="85" w:type="dxa"/>
+              <w:left w:w="85" w:type="dxa"/>
               <w:bottom w:w="85" w:type="dxa"/>
-              <w:left w:w="85" w:type="dxa"/>
               <w:right w:w="85" w:type="dxa"/>
             </w:tcMar>
           </w:tcPr>
@@ -846,15 +846,15 @@
             <w:tcW w:type="dxa" w:w="1827"/>
             <w:tcBorders>
               <w:top w:val="single" w:sz="4" w:color="D9D9D9"/>
+              <w:left w:val="single" w:sz="4" w:color="D9D9D9"/>
               <w:bottom w:val="single" w:sz="4" w:color="D9D9D9"/>
-              <w:left w:val="single" w:sz="4" w:color="D9D9D9"/>
               <w:right w:val="single" w:sz="4" w:color="D9D9D9"/>
             </w:tcBorders>
             <w:shd w:fill="FFFFFF"/>
             <w:tcMar>
               <w:top w:w="85" w:type="dxa"/>
+              <w:left w:w="85" w:type="dxa"/>
               <w:bottom w:w="85" w:type="dxa"/>
-              <w:left w:w="85" w:type="dxa"/>
               <w:right w:w="85" w:type="dxa"/>
             </w:tcMar>
           </w:tcPr>
@@ -876,15 +876,15 @@
             <w:tcW w:type="dxa" w:w="1827"/>
             <w:tcBorders>
               <w:top w:val="single" w:sz="4" w:color="D9D9D9"/>
+              <w:left w:val="single" w:sz="4" w:color="D9D9D9"/>
               <w:bottom w:val="single" w:sz="4" w:color="D9D9D9"/>
-              <w:left w:val="single" w:sz="4" w:color="D9D9D9"/>
               <w:right w:val="single" w:sz="4" w:color="D9D9D9"/>
             </w:tcBorders>
             <w:shd w:fill="FFFFFF"/>
             <w:tcMar>
               <w:top w:w="85" w:type="dxa"/>
+              <w:left w:w="85" w:type="dxa"/>
               <w:bottom w:w="85" w:type="dxa"/>
-              <w:left w:w="85" w:type="dxa"/>
               <w:right w:w="85" w:type="dxa"/>
             </w:tcMar>
           </w:tcPr>
@@ -908,15 +908,15 @@
             <w:tcW w:type="dxa" w:w="4670"/>
             <w:tcBorders>
               <w:top w:val="single" w:sz="4" w:color="D9D9D9"/>
+              <w:left w:val="single" w:sz="4" w:color="D9D9D9"/>
               <w:bottom w:val="single" w:sz="4" w:color="D9D9D9"/>
-              <w:left w:val="single" w:sz="4" w:color="D9D9D9"/>
               <w:right w:val="single" w:sz="4" w:color="D9D9D9"/>
             </w:tcBorders>
             <w:shd w:fill="F1F5F7"/>
             <w:tcMar>
               <w:top w:w="85" w:type="dxa"/>
+              <w:left w:w="85" w:type="dxa"/>
               <w:bottom w:w="85" w:type="dxa"/>
-              <w:left w:w="85" w:type="dxa"/>
               <w:right w:w="85" w:type="dxa"/>
             </w:tcMar>
           </w:tcPr>
@@ -939,15 +939,15 @@
             <w:tcW w:type="dxa" w:w="1827"/>
             <w:tcBorders>
               <w:top w:val="single" w:sz="4" w:color="D9D9D9"/>
+              <w:left w:val="single" w:sz="4" w:color="D9D9D9"/>
               <w:bottom w:val="single" w:sz="4" w:color="D9D9D9"/>
-              <w:left w:val="single" w:sz="4" w:color="D9D9D9"/>
               <w:right w:val="single" w:sz="4" w:color="D9D9D9"/>
             </w:tcBorders>
             <w:shd w:fill="F1F5F7"/>
             <w:tcMar>
               <w:top w:w="85" w:type="dxa"/>
+              <w:left w:w="85" w:type="dxa"/>
               <w:bottom w:w="85" w:type="dxa"/>
-              <w:left w:w="85" w:type="dxa"/>
               <w:right w:w="85" w:type="dxa"/>
             </w:tcMar>
           </w:tcPr>
@@ -970,15 +970,15 @@
             <w:tcW w:type="dxa" w:w="1827"/>
             <w:tcBorders>
               <w:top w:val="single" w:sz="4" w:color="D9D9D9"/>
+              <w:left w:val="single" w:sz="4" w:color="D9D9D9"/>
               <w:bottom w:val="single" w:sz="4" w:color="D9D9D9"/>
-              <w:left w:val="single" w:sz="4" w:color="D9D9D9"/>
               <w:right w:val="single" w:sz="4" w:color="D9D9D9"/>
             </w:tcBorders>
             <w:shd w:fill="F1F5F7"/>
             <w:tcMar>
               <w:top w:w="85" w:type="dxa"/>
+              <w:left w:w="85" w:type="dxa"/>
               <w:bottom w:w="85" w:type="dxa"/>
-              <w:left w:w="85" w:type="dxa"/>
               <w:right w:w="85" w:type="dxa"/>
             </w:tcMar>
           </w:tcPr>
@@ -1000,15 +1000,15 @@
             <w:tcW w:type="dxa" w:w="1827"/>
             <w:tcBorders>
               <w:top w:val="single" w:sz="4" w:color="D9D9D9"/>
+              <w:left w:val="single" w:sz="4" w:color="D9D9D9"/>
               <w:bottom w:val="single" w:sz="4" w:color="D9D9D9"/>
-              <w:left w:val="single" w:sz="4" w:color="D9D9D9"/>
               <w:right w:val="single" w:sz="4" w:color="D9D9D9"/>
             </w:tcBorders>
             <w:shd w:fill="F1F5F7"/>
             <w:tcMar>
               <w:top w:w="85" w:type="dxa"/>
+              <w:left w:w="85" w:type="dxa"/>
               <w:bottom w:w="85" w:type="dxa"/>
-              <w:left w:w="85" w:type="dxa"/>
               <w:right w:w="85" w:type="dxa"/>
             </w:tcMar>
           </w:tcPr>
@@ -1032,15 +1032,15 @@
             <w:tcW w:type="dxa" w:w="4670"/>
             <w:tcBorders>
               <w:top w:val="single" w:sz="4" w:color="D9D9D9"/>
+              <w:left w:val="single" w:sz="4" w:color="D9D9D9"/>
               <w:bottom w:val="single" w:sz="4" w:color="D9D9D9"/>
-              <w:left w:val="single" w:sz="4" w:color="D9D9D9"/>
               <w:right w:val="single" w:sz="4" w:color="D9D9D9"/>
             </w:tcBorders>
             <w:shd w:fill="FFFFFF"/>
             <w:tcMar>
               <w:top w:w="85" w:type="dxa"/>
+              <w:left w:w="85" w:type="dxa"/>
               <w:bottom w:w="85" w:type="dxa"/>
-              <w:left w:w="85" w:type="dxa"/>
               <w:right w:w="85" w:type="dxa"/>
             </w:tcMar>
           </w:tcPr>
@@ -1063,15 +1063,15 @@
             <w:tcW w:type="dxa" w:w="1827"/>
             <w:tcBorders>
               <w:top w:val="single" w:sz="4" w:color="D9D9D9"/>
+              <w:left w:val="single" w:sz="4" w:color="D9D9D9"/>
               <w:bottom w:val="single" w:sz="4" w:color="D9D9D9"/>
-              <w:left w:val="single" w:sz="4" w:color="D9D9D9"/>
               <w:right w:val="single" w:sz="4" w:color="D9D9D9"/>
             </w:tcBorders>
             <w:shd w:fill="FFFFFF"/>
             <w:tcMar>
               <w:top w:w="85" w:type="dxa"/>
+              <w:left w:w="85" w:type="dxa"/>
               <w:bottom w:w="85" w:type="dxa"/>
-              <w:left w:w="85" w:type="dxa"/>
               <w:right w:w="85" w:type="dxa"/>
             </w:tcMar>
           </w:tcPr>
@@ -1094,15 +1094,15 @@
             <w:tcW w:type="dxa" w:w="1827"/>
             <w:tcBorders>
               <w:top w:val="single" w:sz="4" w:color="D9D9D9"/>
+              <w:left w:val="single" w:sz="4" w:color="D9D9D9"/>
               <w:bottom w:val="single" w:sz="4" w:color="D9D9D9"/>
-              <w:left w:val="single" w:sz="4" w:color="D9D9D9"/>
               <w:right w:val="single" w:sz="4" w:color="D9D9D9"/>
             </w:tcBorders>
             <w:shd w:fill="FFFFFF"/>
             <w:tcMar>
               <w:top w:w="85" w:type="dxa"/>
+              <w:left w:w="85" w:type="dxa"/>
               <w:bottom w:w="85" w:type="dxa"/>
-              <w:left w:w="85" w:type="dxa"/>
               <w:right w:w="85" w:type="dxa"/>
             </w:tcMar>
           </w:tcPr>
@@ -1124,15 +1124,15 @@
             <w:tcW w:type="dxa" w:w="1827"/>
             <w:tcBorders>
               <w:top w:val="single" w:sz="4" w:color="D9D9D9"/>
+              <w:left w:val="single" w:sz="4" w:color="D9D9D9"/>
               <w:bottom w:val="single" w:sz="4" w:color="D9D9D9"/>
-              <w:left w:val="single" w:sz="4" w:color="D9D9D9"/>
               <w:right w:val="single" w:sz="4" w:color="D9D9D9"/>
             </w:tcBorders>
             <w:shd w:fill="FFFFFF"/>
             <w:tcMar>
               <w:top w:w="85" w:type="dxa"/>
+              <w:left w:w="85" w:type="dxa"/>
               <w:bottom w:w="85" w:type="dxa"/>
-              <w:left w:w="85" w:type="dxa"/>
               <w:right w:w="85" w:type="dxa"/>
             </w:tcMar>
           </w:tcPr>
@@ -1156,15 +1156,15 @@
             <w:tcW w:type="dxa" w:w="4670"/>
             <w:tcBorders>
               <w:top w:val="single" w:sz="4" w:color="D9D9D9"/>
+              <w:left w:val="single" w:sz="4" w:color="D9D9D9"/>
               <w:bottom w:val="single" w:sz="4" w:color="D9D9D9"/>
-              <w:left w:val="single" w:sz="4" w:color="D9D9D9"/>
               <w:right w:val="single" w:sz="4" w:color="D9D9D9"/>
             </w:tcBorders>
             <w:shd w:fill="F1F5F7"/>
             <w:tcMar>
               <w:top w:w="85" w:type="dxa"/>
+              <w:left w:w="85" w:type="dxa"/>
               <w:bottom w:w="85" w:type="dxa"/>
-              <w:left w:w="85" w:type="dxa"/>
               <w:right w:w="85" w:type="dxa"/>
             </w:tcMar>
           </w:tcPr>
@@ -1187,15 +1187,15 @@
             <w:tcW w:type="dxa" w:w="1827"/>
             <w:tcBorders>
               <w:top w:val="single" w:sz="4" w:color="D9D9D9"/>
+              <w:left w:val="single" w:sz="4" w:color="D9D9D9"/>
               <w:bottom w:val="single" w:sz="4" w:color="D9D9D9"/>
-              <w:left w:val="single" w:sz="4" w:color="D9D9D9"/>
               <w:right w:val="single" w:sz="4" w:color="D9D9D9"/>
             </w:tcBorders>
             <w:shd w:fill="F1F5F7"/>
             <w:tcMar>
               <w:top w:w="85" w:type="dxa"/>
+              <w:left w:w="85" w:type="dxa"/>
               <w:bottom w:w="85" w:type="dxa"/>
-              <w:left w:w="85" w:type="dxa"/>
               <w:right w:w="85" w:type="dxa"/>
             </w:tcMar>
           </w:tcPr>
@@ -1218,15 +1218,15 @@
             <w:tcW w:type="dxa" w:w="1827"/>
             <w:tcBorders>
               <w:top w:val="single" w:sz="4" w:color="D9D9D9"/>
+              <w:left w:val="single" w:sz="4" w:color="D9D9D9"/>
               <w:bottom w:val="single" w:sz="4" w:color="D9D9D9"/>
-              <w:left w:val="single" w:sz="4" w:color="D9D9D9"/>
               <w:right w:val="single" w:sz="4" w:color="D9D9D9"/>
             </w:tcBorders>
             <w:shd w:fill="F1F5F7"/>
             <w:tcMar>
               <w:top w:w="85" w:type="dxa"/>
+              <w:left w:w="85" w:type="dxa"/>
               <w:bottom w:w="85" w:type="dxa"/>
-              <w:left w:w="85" w:type="dxa"/>
               <w:right w:w="85" w:type="dxa"/>
             </w:tcMar>
           </w:tcPr>
@@ -1249,15 +1249,15 @@
             <w:tcW w:type="dxa" w:w="1827"/>
             <w:tcBorders>
               <w:top w:val="single" w:sz="4" w:color="D9D9D9"/>
+              <w:left w:val="single" w:sz="4" w:color="D9D9D9"/>
               <w:bottom w:val="single" w:sz="4" w:color="D9D9D9"/>
-              <w:left w:val="single" w:sz="4" w:color="D9D9D9"/>
               <w:right w:val="single" w:sz="4" w:color="D9D9D9"/>
             </w:tcBorders>
             <w:shd w:fill="F1F5F7"/>
             <w:tcMar>
               <w:top w:w="85" w:type="dxa"/>
+              <w:left w:w="85" w:type="dxa"/>
               <w:bottom w:w="85" w:type="dxa"/>
-              <w:left w:w="85" w:type="dxa"/>
               <w:right w:w="85" w:type="dxa"/>
             </w:tcMar>
           </w:tcPr>
@@ -1282,15 +1282,15 @@
             <w:tcW w:type="dxa" w:w="4670"/>
             <w:tcBorders>
               <w:top w:val="single" w:sz="4" w:color="D9D9D9"/>
+              <w:left w:val="single" w:sz="4" w:color="D9D9D9"/>
               <w:bottom w:val="single" w:sz="4" w:color="D9D9D9"/>
-              <w:left w:val="single" w:sz="4" w:color="D9D9D9"/>
               <w:right w:val="single" w:sz="4" w:color="D9D9D9"/>
             </w:tcBorders>
             <w:shd w:fill="FFFFFF"/>
             <w:tcMar>
               <w:top w:w="85" w:type="dxa"/>
+              <w:left w:w="85" w:type="dxa"/>
               <w:bottom w:w="85" w:type="dxa"/>
-              <w:left w:w="85" w:type="dxa"/>
               <w:right w:w="85" w:type="dxa"/>
             </w:tcMar>
           </w:tcPr>
@@ -1313,15 +1313,15 @@
             <w:tcW w:type="dxa" w:w="1827"/>
             <w:tcBorders>
               <w:top w:val="single" w:sz="4" w:color="D9D9D9"/>
+              <w:left w:val="single" w:sz="4" w:color="D9D9D9"/>
               <w:bottom w:val="single" w:sz="4" w:color="D9D9D9"/>
-              <w:left w:val="single" w:sz="4" w:color="D9D9D9"/>
               <w:right w:val="single" w:sz="4" w:color="D9D9D9"/>
             </w:tcBorders>
             <w:shd w:fill="FFFFFF"/>
             <w:tcMar>
               <w:top w:w="85" w:type="dxa"/>
+              <w:left w:w="85" w:type="dxa"/>
               <w:bottom w:w="85" w:type="dxa"/>
-              <w:left w:w="85" w:type="dxa"/>
               <w:right w:w="85" w:type="dxa"/>
             </w:tcMar>
           </w:tcPr>
@@ -1344,15 +1344,15 @@
             <w:tcW w:type="dxa" w:w="1827"/>
             <w:tcBorders>
               <w:top w:val="single" w:sz="4" w:color="D9D9D9"/>
+              <w:left w:val="single" w:sz="4" w:color="D9D9D9"/>
               <w:bottom w:val="single" w:sz="4" w:color="D9D9D9"/>
-              <w:left w:val="single" w:sz="4" w:color="D9D9D9"/>
               <w:right w:val="single" w:sz="4" w:color="D9D9D9"/>
             </w:tcBorders>
             <w:shd w:fill="FFFFFF"/>
             <w:tcMar>
               <w:top w:w="85" w:type="dxa"/>
+              <w:left w:w="85" w:type="dxa"/>
               <w:bottom w:w="85" w:type="dxa"/>
-              <w:left w:w="85" w:type="dxa"/>
               <w:right w:w="85" w:type="dxa"/>
             </w:tcMar>
           </w:tcPr>
@@ -1374,15 +1374,15 @@
             <w:tcW w:type="dxa" w:w="1827"/>
             <w:tcBorders>
               <w:top w:val="single" w:sz="4" w:color="D9D9D9"/>
+              <w:left w:val="single" w:sz="4" w:color="D9D9D9"/>
               <w:bottom w:val="single" w:sz="4" w:color="D9D9D9"/>
-              <w:left w:val="single" w:sz="4" w:color="D9D9D9"/>
               <w:right w:val="single" w:sz="4" w:color="D9D9D9"/>
             </w:tcBorders>
             <w:shd w:fill="FFFFFF"/>
             <w:tcMar>
               <w:top w:w="85" w:type="dxa"/>
+              <w:left w:w="85" w:type="dxa"/>
               <w:bottom w:w="85" w:type="dxa"/>
-              <w:left w:w="85" w:type="dxa"/>
               <w:right w:w="85" w:type="dxa"/>
             </w:tcMar>
           </w:tcPr>
@@ -1406,15 +1406,15 @@
             <w:tcW w:type="dxa" w:w="4670"/>
             <w:tcBorders>
               <w:top w:val="single" w:sz="4" w:color="D9D9D9"/>
+              <w:left w:val="single" w:sz="4" w:color="D9D9D9"/>
               <w:bottom w:val="single" w:sz="4" w:color="D9D9D9"/>
-              <w:left w:val="single" w:sz="4" w:color="D9D9D9"/>
               <w:right w:val="single" w:sz="4" w:color="D9D9D9"/>
             </w:tcBorders>
             <w:shd w:fill="F1F5F7"/>
             <w:tcMar>
               <w:top w:w="85" w:type="dxa"/>
+              <w:left w:w="85" w:type="dxa"/>
               <w:bottom w:w="85" w:type="dxa"/>
-              <w:left w:w="85" w:type="dxa"/>
               <w:right w:w="85" w:type="dxa"/>
             </w:tcMar>
           </w:tcPr>
@@ -1437,15 +1437,15 @@
             <w:tcW w:type="dxa" w:w="1827"/>
             <w:tcBorders>
               <w:top w:val="single" w:sz="4" w:color="D9D9D9"/>
+              <w:left w:val="single" w:sz="4" w:color="D9D9D9"/>
               <w:bottom w:val="single" w:sz="4" w:color="D9D9D9"/>
-              <w:left w:val="single" w:sz="4" w:color="D9D9D9"/>
               <w:right w:val="single" w:sz="4" w:color="D9D9D9"/>
             </w:tcBorders>
             <w:shd w:fill="F1F5F7"/>
             <w:tcMar>
               <w:top w:w="85" w:type="dxa"/>
+              <w:left w:w="85" w:type="dxa"/>
               <w:bottom w:w="85" w:type="dxa"/>
-              <w:left w:w="85" w:type="dxa"/>
               <w:right w:w="85" w:type="dxa"/>
             </w:tcMar>
           </w:tcPr>
@@ -1468,15 +1468,15 @@
             <w:tcW w:type="dxa" w:w="1827"/>
             <w:tcBorders>
               <w:top w:val="single" w:sz="4" w:color="D9D9D9"/>
+              <w:left w:val="single" w:sz="4" w:color="D9D9D9"/>
               <w:bottom w:val="single" w:sz="4" w:color="D9D9D9"/>
-              <w:left w:val="single" w:sz="4" w:color="D9D9D9"/>
               <w:right w:val="single" w:sz="4" w:color="D9D9D9"/>
             </w:tcBorders>
             <w:shd w:fill="F1F5F7"/>
             <w:tcMar>
               <w:top w:w="85" w:type="dxa"/>
+              <w:left w:w="85" w:type="dxa"/>
               <w:bottom w:w="85" w:type="dxa"/>
-              <w:left w:w="85" w:type="dxa"/>
               <w:right w:w="85" w:type="dxa"/>
             </w:tcMar>
           </w:tcPr>
@@ -1498,15 +1498,15 @@
             <w:tcW w:type="dxa" w:w="1827"/>
             <w:tcBorders>
               <w:top w:val="single" w:sz="4" w:color="D9D9D9"/>
+              <w:left w:val="single" w:sz="4" w:color="D9D9D9"/>
               <w:bottom w:val="single" w:sz="4" w:color="D9D9D9"/>
-              <w:left w:val="single" w:sz="4" w:color="D9D9D9"/>
               <w:right w:val="single" w:sz="4" w:color="D9D9D9"/>
             </w:tcBorders>
             <w:shd w:fill="F1F5F7"/>
             <w:tcMar>
               <w:top w:w="85" w:type="dxa"/>
+              <w:left w:w="85" w:type="dxa"/>
               <w:bottom w:w="85" w:type="dxa"/>
-              <w:left w:w="85" w:type="dxa"/>
               <w:right w:w="85" w:type="dxa"/>
             </w:tcMar>
           </w:tcPr>
@@ -1530,15 +1530,15 @@
             <w:tcW w:type="dxa" w:w="4670"/>
             <w:tcBorders>
               <w:top w:val="single" w:sz="4" w:color="D9D9D9"/>
+              <w:left w:val="single" w:sz="4" w:color="D9D9D9"/>
               <w:bottom w:val="single" w:sz="4" w:color="D9D9D9"/>
-              <w:left w:val="single" w:sz="4" w:color="D9D9D9"/>
               <w:right w:val="single" w:sz="4" w:color="D9D9D9"/>
             </w:tcBorders>
             <w:shd w:fill="FFFFFF"/>
             <w:tcMar>
               <w:top w:w="85" w:type="dxa"/>
+              <w:left w:w="85" w:type="dxa"/>
               <w:bottom w:w="85" w:type="dxa"/>
-              <w:left w:w="85" w:type="dxa"/>
               <w:right w:w="85" w:type="dxa"/>
             </w:tcMar>
           </w:tcPr>
@@ -1561,15 +1561,15 @@
             <w:tcW w:type="dxa" w:w="1827"/>
             <w:tcBorders>
               <w:top w:val="single" w:sz="4" w:color="D9D9D9"/>
+              <w:left w:val="single" w:sz="4" w:color="D9D9D9"/>
               <w:bottom w:val="single" w:sz="4" w:color="D9D9D9"/>
-              <w:left w:val="single" w:sz="4" w:color="D9D9D9"/>
               <w:right w:val="single" w:sz="4" w:color="D9D9D9"/>
             </w:tcBorders>
             <w:shd w:fill="FFFFFF"/>
             <w:tcMar>
               <w:top w:w="85" w:type="dxa"/>
+              <w:left w:w="85" w:type="dxa"/>
               <w:bottom w:w="85" w:type="dxa"/>
-              <w:left w:w="85" w:type="dxa"/>
               <w:right w:w="85" w:type="dxa"/>
             </w:tcMar>
           </w:tcPr>
@@ -1592,15 +1592,15 @@
             <w:tcW w:type="dxa" w:w="1827"/>
             <w:tcBorders>
               <w:top w:val="single" w:sz="4" w:color="D9D9D9"/>
+              <w:left w:val="single" w:sz="4" w:color="D9D9D9"/>
               <w:bottom w:val="single" w:sz="4" w:color="D9D9D9"/>
-              <w:left w:val="single" w:sz="4" w:color="D9D9D9"/>
               <w:right w:val="single" w:sz="4" w:color="D9D9D9"/>
             </w:tcBorders>
             <w:shd w:fill="FFFFFF"/>
             <w:tcMar>
               <w:top w:w="85" w:type="dxa"/>
+              <w:left w:w="85" w:type="dxa"/>
               <w:bottom w:w="85" w:type="dxa"/>
-              <w:left w:w="85" w:type="dxa"/>
               <w:right w:w="85" w:type="dxa"/>
             </w:tcMar>
           </w:tcPr>
@@ -1622,15 +1622,15 @@
             <w:tcW w:type="dxa" w:w="1827"/>
             <w:tcBorders>
               <w:top w:val="single" w:sz="4" w:color="D9D9D9"/>
+              <w:left w:val="single" w:sz="4" w:color="D9D9D9"/>
               <w:bottom w:val="single" w:sz="4" w:color="D9D9D9"/>
-              <w:left w:val="single" w:sz="4" w:color="D9D9D9"/>
               <w:right w:val="single" w:sz="4" w:color="D9D9D9"/>
             </w:tcBorders>
             <w:shd w:fill="FFFFFF"/>
             <w:tcMar>
               <w:top w:w="85" w:type="dxa"/>
+              <w:left w:w="85" w:type="dxa"/>
               <w:bottom w:w="85" w:type="dxa"/>
-              <w:left w:w="85" w:type="dxa"/>
               <w:right w:w="85" w:type="dxa"/>
             </w:tcMar>
           </w:tcPr>

</xml_diff>